<commit_message>
feat: unificacion de modulos, actualizacion de dependencias, spec relativo y plantillas
</commit_message>
<xml_diff>
--- a/plantillas/plantilla_informe_no_viable.docx
+++ b/plantillas/plantilla_informe_no_viable.docx
@@ -3380,36 +3380,50 @@
           <w:sz w:val="22"/>
           <w:szCs w:val="22"/>
         </w:rPr>
-        <w:t xml:space="preserve">De lo expuesto, debemos indicar que la ampliación excepcional de la duración del periodo de estudios procede cuando el becario </w:t>
-      </w:r>
-      <w:r>
-        <w:rPr>
-          <w:sz w:val="22"/>
-          <w:szCs w:val="22"/>
-        </w:rPr>
-        <w:t>después del último periodo programado en el SIBEC</w:t>
-      </w:r>
-      <w:r>
-        <w:rPr>
-          <w:sz w:val="22"/>
-          <w:szCs w:val="22"/>
-        </w:rPr>
-        <w:t xml:space="preserve">, presenta su solicitud </w:t>
-      </w:r>
-      <w:r>
-        <w:rPr>
-          <w:sz w:val="22"/>
-          <w:szCs w:val="22"/>
-          <w:u w:val="single"/>
-        </w:rPr>
-        <w:t>antes de la matrícula e inicio del periodo académico a ampliar</w:t>
-      </w:r>
-      <w:r>
-        <w:rPr>
-          <w:sz w:val="22"/>
-          <w:szCs w:val="22"/>
-        </w:rPr>
-        <w:t>,</w:t>
+        <w:t xml:space="preserve">De lo expuesto, debemos indicar que la ampliación excepcional de la duración del periodo de estudios </w:t>
+      </w:r>
+      <w:bookmarkStart w:id="4" w:name="_GoBack"/>
+      <w:r>
+        <w:rPr>
+          <w:sz w:val="22"/>
+          <w:szCs w:val="22"/>
+        </w:rPr>
+        <w:t xml:space="preserve">procede cuando el becario </w:t>
+      </w:r>
+      <w:r>
+        <w:rPr>
+          <w:sz w:val="22"/>
+          <w:szCs w:val="22"/>
+        </w:rPr>
+        <w:t>después del último periodo programado en el SIBEC, presenta su solicitud antes de la matrícula e inicio del periodo académico a ampliar</w:t>
+      </w:r>
+      <w:r>
+        <w:rPr>
+          <w:sz w:val="22"/>
+          <w:szCs w:val="22"/>
+        </w:rPr>
+        <w:t xml:space="preserve">, </w:t>
+      </w:r>
+      <w:r>
+        <w:rPr>
+          <w:sz w:val="22"/>
+          <w:szCs w:val="22"/>
+        </w:rPr>
+        <w:t>acreditando</w:t>
+      </w:r>
+      <w:r>
+        <w:rPr>
+          <w:sz w:val="22"/>
+          <w:szCs w:val="22"/>
+        </w:rPr>
+        <w:t xml:space="preserve"> que </w:t>
+      </w:r>
+      <w:r>
+        <w:rPr>
+          <w:sz w:val="22"/>
+          <w:szCs w:val="22"/>
+        </w:rPr>
+        <w:t>aún no ha culminado sus estudios</w:t>
       </w:r>
       <w:r>
         <w:rPr>
@@ -3423,21 +3437,14 @@
           <w:sz w:val="22"/>
           <w:szCs w:val="22"/>
         </w:rPr>
-        <w:t>acreditando</w:t>
-      </w:r>
-      <w:r>
-        <w:rPr>
-          <w:sz w:val="22"/>
-          <w:szCs w:val="22"/>
-        </w:rPr>
-        <w:t xml:space="preserve"> que </w:t>
-      </w:r>
-      <w:r>
-        <w:rPr>
-          <w:sz w:val="22"/>
-          <w:szCs w:val="22"/>
-        </w:rPr>
-        <w:t>aún no ha culminado sus estudios</w:t>
+        <w:t xml:space="preserve">y tiene cursos pendientes, </w:t>
+      </w:r>
+      <w:r>
+        <w:rPr>
+          <w:sz w:val="22"/>
+          <w:szCs w:val="22"/>
+        </w:rPr>
+        <w:t>los cuales</w:t>
       </w:r>
       <w:r>
         <w:rPr>
@@ -3451,38 +3458,15 @@
           <w:sz w:val="22"/>
           <w:szCs w:val="22"/>
         </w:rPr>
-        <w:t xml:space="preserve">y tiene cursos pendientes, </w:t>
-      </w:r>
-      <w:r>
-        <w:rPr>
-          <w:sz w:val="22"/>
-          <w:szCs w:val="22"/>
-          <w:u w:val="single"/>
-        </w:rPr>
-        <w:t>los cuales</w:t>
-      </w:r>
-      <w:r>
-        <w:rPr>
-          <w:sz w:val="22"/>
-          <w:szCs w:val="22"/>
-          <w:u w:val="single"/>
-        </w:rPr>
-        <w:t xml:space="preserve"> </w:t>
-      </w:r>
-      <w:r>
-        <w:rPr>
-          <w:sz w:val="22"/>
-          <w:szCs w:val="22"/>
-          <w:u w:val="single"/>
-        </w:rPr>
-        <w:t>deben ser suficientes para culminar la carrera</w:t>
-      </w:r>
-      <w:r>
-        <w:rPr>
-          <w:sz w:val="22"/>
-          <w:szCs w:val="22"/>
-        </w:rPr>
-        <w:t>, es decir, que con los cursos pendientes que tiene el becario necesariamente culmine la carrera en</w:t>
+        <w:t>deben ser suficientes para culminar la carrera, es decir, que con los cursos pendientes que tiene el becario necesariamente c</w:t>
+      </w:r>
+      <w:bookmarkEnd w:id="4"/>
+      <w:r>
+        <w:rPr>
+          <w:sz w:val="22"/>
+          <w:szCs w:val="22"/>
+        </w:rPr>
+        <w:t>ulmine la carrera en</w:t>
       </w:r>
       <w:r>
         <w:rPr>
@@ -4073,16 +4057,7 @@
           <w:sz w:val="22"/>
           <w:szCs w:val="22"/>
         </w:rPr>
-        <w:t>_LA_BENEFICIARIO_A }} tiene cursos pendientes, los cuales ac</w:t>
-      </w:r>
-      <w:bookmarkStart w:id="4" w:name="_GoBack"/>
-      <w:bookmarkEnd w:id="4"/>
-      <w:r>
-        <w:rPr>
-          <w:sz w:val="22"/>
-          <w:szCs w:val="22"/>
-        </w:rPr>
-        <w:t>reditan que aún no ha culminado sus estudios</w:t>
+        <w:t>_LA_BENEFICIARIO_A }} tiene cursos pendientes, los cuales acreditan que aún no ha culminado sus estudios</w:t>
       </w:r>
       <w:r>
         <w:rPr>
@@ -4117,23 +4092,22 @@
           <w:rFonts w:ascii="Arial" w:hAnsi="Arial" w:cs="Arial"/>
           <w:u w:val="single"/>
         </w:rPr>
-        <w:t xml:space="preserve">Listado de cursos pendientes que tiene </w:t>
-      </w:r>
-      <w:proofErr w:type="gramStart"/>
-      <w:r>
-        <w:rPr>
+        <w:t>Listado de cursos pendientes que tiene {{ EL_LA_BENEFICIARIO_A }}</w:t>
+      </w:r>
+      <w:r>
+        <w:rPr>
+          <w:rStyle w:val="Refdenotaalpie"/>
           <w:rFonts w:ascii="Arial" w:hAnsi="Arial" w:cs="Arial"/>
           <w:u w:val="single"/>
         </w:rPr>
-        <w:t>{{ EL</w:t>
-      </w:r>
-      <w:proofErr w:type="gramEnd"/>
+        <w:footnoteReference w:id="3"/>
+      </w:r>
       <w:r>
         <w:rPr>
           <w:rFonts w:ascii="Arial" w:hAnsi="Arial" w:cs="Arial"/>
           <w:u w:val="single"/>
         </w:rPr>
-        <w:t>_LA_BENEFICIARIO_A }}:</w:t>
+        <w:t>:</w:t>
       </w:r>
     </w:p>
     <w:p>
@@ -5230,7 +5204,14 @@
         <w:rPr>
           <w:rFonts w:ascii="Arial" w:hAnsi="Arial" w:cs="Arial"/>
         </w:rPr>
-        <w:t>no cumplió con el supuesto establecido en las “Disposiciones para el becario del PRONABEC” versión 02, relacionado</w:t>
+        <w:t xml:space="preserve">no cumplió con el supuesto establecido en las “Disposiciones para el becario del PRONABEC” </w:t>
+      </w:r>
+      <w:r>
+        <w:rPr>
+          <w:rFonts w:ascii="Arial" w:hAnsi="Arial" w:cs="Arial"/>
+        </w:rPr>
+        <w:lastRenderedPageBreak/>
+        <w:t>versión 02, relacionado</w:t>
       </w:r>
       <w:r>
         <w:rPr>
@@ -5255,14 +5236,7 @@
         <w:rPr>
           <w:rFonts w:ascii="Arial" w:eastAsia="Arial" w:hAnsi="Arial" w:cs="Arial"/>
         </w:rPr>
-        <w:t xml:space="preserve">resulta no viable la ampliación excepcional de la duración del periodo </w:t>
-      </w:r>
-      <w:r>
-        <w:rPr>
-          <w:rFonts w:ascii="Arial" w:eastAsia="Arial" w:hAnsi="Arial" w:cs="Arial"/>
-        </w:rPr>
-        <w:lastRenderedPageBreak/>
-        <w:t>de estudios por el semestre</w:t>
+        <w:t>resulta no viable la ampliación excepcional de la duración del periodo de estudios por el semestre</w:t>
       </w:r>
       <w:r>
         <w:rPr>
@@ -6487,6 +6461,64 @@
           <w:szCs w:val="18"/>
         </w:rPr>
         <w:t xml:space="preserve"> de 2026. Por ello, no resulta aplicable al presente caso</w:t>
+      </w:r>
+    </w:p>
+  </w:footnote>
+  <w:footnote w:id="3">
+    <w:p>
+      <w:pPr>
+        <w:pStyle w:val="Textonotapie"/>
+        <w:jc w:val="both"/>
+        <w:rPr>
+          <w:rFonts w:ascii="Arial" w:hAnsi="Arial" w:cs="Arial"/>
+          <w:sz w:val="18"/>
+          <w:szCs w:val="18"/>
+          <w:lang w:val="es-ES"/>
+        </w:rPr>
+      </w:pPr>
+      <w:r>
+        <w:rPr>
+          <w:rStyle w:val="Refdenotaalpie"/>
+          <w:rFonts w:ascii="Arial" w:hAnsi="Arial" w:cs="Arial"/>
+          <w:sz w:val="18"/>
+          <w:szCs w:val="18"/>
+        </w:rPr>
+        <w:footnoteRef/>
+      </w:r>
+      <w:r>
+        <w:rPr>
+          <w:rFonts w:ascii="Arial" w:hAnsi="Arial" w:cs="Arial"/>
+          <w:sz w:val="18"/>
+          <w:szCs w:val="18"/>
+        </w:rPr>
+        <w:t xml:space="preserve"> En el documento de l</w:t>
+      </w:r>
+      <w:r>
+        <w:rPr>
+          <w:rFonts w:ascii="Arial" w:hAnsi="Arial" w:cs="Arial"/>
+          <w:sz w:val="18"/>
+          <w:szCs w:val="18"/>
+          <w:lang w:val="es-ES"/>
+        </w:rPr>
+        <w:t xml:space="preserve">a IES se señala que no culminaría su carrera con los </w:t>
+      </w:r>
+      <w:r>
+        <w:rPr>
+          <w:rFonts w:ascii="Arial" w:hAnsi="Arial" w:cs="Arial"/>
+          <w:sz w:val="18"/>
+          <w:szCs w:val="18"/>
+          <w:lang w:val="es-ES"/>
+        </w:rPr>
+        <w:t xml:space="preserve">cursos y </w:t>
+      </w:r>
+      <w:r>
+        <w:rPr>
+          <w:rFonts w:ascii="Arial" w:hAnsi="Arial" w:cs="Arial"/>
+          <w:sz w:val="18"/>
+          <w:szCs w:val="18"/>
+          <w:lang w:val="es-ES"/>
+        </w:rPr>
+        <w:t>créditos que tiene pendientes en el semestre 2026-II.</w:t>
       </w:r>
     </w:p>
   </w:footnote>
@@ -11778,7 +11810,7 @@
 </file>
 
 <file path=customXml/itemProps1.xml><?xml version="1.0" encoding="utf-8"?>
-<ds:datastoreItem xmlns:ds="http://schemas.openxmlformats.org/officeDocument/2006/customXml" ds:itemID="{A9B60671-6DCC-4271-803D-00A1B562484F}">
+<ds:datastoreItem xmlns:ds="http://schemas.openxmlformats.org/officeDocument/2006/customXml" ds:itemID="{8AA1EF4D-E10A-4BDD-B96A-F7156BD38EA9}">
   <ds:schemaRefs>
     <ds:schemaRef ds:uri="http://schemas.openxmlformats.org/officeDocument/2006/bibliography"/>
   </ds:schemaRefs>

</xml_diff>